<commit_message>
update toru w allicante
</commit_message>
<xml_diff>
--- a/public/posts/tracks/karting932/text1.docx
+++ b/public/posts/tracks/karting932/text1.docx
@@ -1,6 +1,6 @@
 
 <file path=word/document.xml><?xml version="1.0" encoding="utf-8"?>
-<w:document xmlns:wpc="http://schemas.microsoft.com/office/word/2010/wordprocessingCanvas" xmlns:cx="http://schemas.microsoft.com/office/drawing/2014/chartex" xmlns:cx1="http://schemas.microsoft.com/office/drawing/2015/9/8/chartex" xmlns:cx2="http://schemas.microsoft.com/office/drawing/2015/10/21/chartex" xmlns:cx3="http://schemas.microsoft.com/office/drawing/2016/5/9/chartex" xmlns:cx4="http://schemas.microsoft.com/office/drawing/2016/5/10/chartex" xmlns:cx5="http://schemas.microsoft.com/office/drawing/2016/5/11/chartex" xmlns:cx6="http://schemas.microsoft.com/office/drawing/2016/5/12/chartex" xmlns:cx7="http://schemas.microsoft.com/office/drawing/2016/5/13/chartex" xmlns:cx8="http://schemas.microsoft.com/office/drawing/2016/5/14/chartex" xmlns:mc="http://schemas.openxmlformats.org/markup-compatibility/2006" xmlns:aink="http://schemas.microsoft.com/office/drawing/2016/ink" xmlns:am3d="http://schemas.microsoft.com/office/drawing/2017/model3d" xmlns:o="urn:schemas-microsoft-com:office:office" xmlns:oel="http://schemas.microsoft.com/office/2019/extlst" xmlns:r="http://schemas.openxmlformats.org/officeDocument/2006/relationships" xmlns:m="http://schemas.openxmlformats.org/officeDocument/2006/math" xmlns:v="urn:schemas-microsoft-com:vml" xmlns:wp14="http://schemas.microsoft.com/office/word/2010/wordprocessingDrawing" xmlns:wp="http://schemas.openxmlformats.org/drawingml/2006/wordprocessingDrawing" xmlns:w10="urn:schemas-microsoft-com:office:word" xmlns:w="http://schemas.openxmlformats.org/wordprocessingml/2006/main" xmlns:w14="http://schemas.microsoft.com/office/word/2010/wordml" xmlns:w15="http://schemas.microsoft.com/office/word/2012/wordml" xmlns:w16cex="http://schemas.microsoft.com/office/word/2018/wordml/cex" xmlns:w16cid="http://schemas.microsoft.com/office/word/2016/wordml/cid" xmlns:w16="http://schemas.microsoft.com/office/word/2018/wordml" xmlns:w16sdtdh="http://schemas.microsoft.com/office/word/2020/wordml/sdtdatahash" xmlns:w16se="http://schemas.microsoft.com/office/word/2015/wordml/symex" xmlns:wpg="http://schemas.microsoft.com/office/word/2010/wordprocessingGroup" xmlns:wpi="http://schemas.microsoft.com/office/word/2010/wordprocessingInk" xmlns:wne="http://schemas.microsoft.com/office/word/2006/wordml" xmlns:wps="http://schemas.microsoft.com/office/word/2010/wordprocessingShape" mc:Ignorable="w14 w15 w16se w16cid w16 w16cex w16sdtdh wp14">
+<w:document xmlns:wpc="http://schemas.microsoft.com/office/word/2010/wordprocessingCanvas" xmlns:cx="http://schemas.microsoft.com/office/drawing/2014/chartex" xmlns:cx1="http://schemas.microsoft.com/office/drawing/2015/9/8/chartex" xmlns:cx2="http://schemas.microsoft.com/office/drawing/2015/10/21/chartex" xmlns:cx3="http://schemas.microsoft.com/office/drawing/2016/5/9/chartex" xmlns:cx4="http://schemas.microsoft.com/office/drawing/2016/5/10/chartex" xmlns:cx5="http://schemas.microsoft.com/office/drawing/2016/5/11/chartex" xmlns:cx6="http://schemas.microsoft.com/office/drawing/2016/5/12/chartex" xmlns:cx7="http://schemas.microsoft.com/office/drawing/2016/5/13/chartex" xmlns:cx8="http://schemas.microsoft.com/office/drawing/2016/5/14/chartex" xmlns:mc="http://schemas.openxmlformats.org/markup-compatibility/2006" xmlns:aink="http://schemas.microsoft.com/office/drawing/2016/ink" xmlns:am3d="http://schemas.microsoft.com/office/drawing/2017/model3d" xmlns:o="urn:schemas-microsoft-com:office:office" xmlns:oel="http://schemas.microsoft.com/office/2019/extlst" xmlns:r="http://schemas.openxmlformats.org/officeDocument/2006/relationships" xmlns:m="http://schemas.openxmlformats.org/officeDocument/2006/math" xmlns:v="urn:schemas-microsoft-com:vml" xmlns:wp14="http://schemas.microsoft.com/office/word/2010/wordprocessingDrawing" xmlns:wp="http://schemas.openxmlformats.org/drawingml/2006/wordprocessingDrawing" xmlns:w10="urn:schemas-microsoft-com:office:word" xmlns:w="http://schemas.openxmlformats.org/wordprocessingml/2006/main" xmlns:w14="http://schemas.microsoft.com/office/word/2010/wordml" xmlns:w15="http://schemas.microsoft.com/office/word/2012/wordml" xmlns:w16cex="http://schemas.microsoft.com/office/word/2018/wordml/cex" xmlns:w16cid="http://schemas.microsoft.com/office/word/2016/wordml/cid" xmlns:w16="http://schemas.microsoft.com/office/word/2018/wordml" xmlns:w16du="http://schemas.microsoft.com/office/word/2023/wordml/word16du" xmlns:w16sdtdh="http://schemas.microsoft.com/office/word/2020/wordml/sdtdatahash" xmlns:w16se="http://schemas.microsoft.com/office/word/2015/wordml/symex" xmlns:wpg="http://schemas.microsoft.com/office/word/2010/wordprocessingGroup" xmlns:wpi="http://schemas.microsoft.com/office/word/2010/wordprocessingInk" xmlns:wne="http://schemas.microsoft.com/office/word/2006/wordml" xmlns:wps="http://schemas.microsoft.com/office/word/2010/wordprocessingShape" mc:Ignorable="w14 w15 w16se w16cid w16 w16cex w16sdtdh w16du wp14">
   <w:body>
     <w:p>
       <w:pPr>
@@ -27,6 +27,18 @@
           <w14:ligatures w14:val="none"/>
         </w:rPr>
         <w:t>Miła niespodzianka w turystycznym Alicante!</w:t>
+      </w:r>
+      <w:r>
+        <w:rPr>
+          <w:rFonts w:ascii="Consolas" w:eastAsia="Times New Roman" w:hAnsi="Consolas" w:cs="Times New Roman"/>
+          <w:color w:val="A31515"/>
+          <w:kern w:val="0"/>
+          <w:sz w:val="21"/>
+          <w:szCs w:val="21"/>
+          <w:lang w:val="pl-PL"/>
+          <w14:ligatures w14:val="none"/>
+        </w:rPr>
+        <w:t xml:space="preserve"> (i mieszane drugie wrażenie)</w:t>
       </w:r>
     </w:p>
     <w:p>
@@ -173,6 +185,33 @@
           <w14:ligatures w14:val="none"/>
         </w:rPr>
       </w:pPr>
+      <w:r>
+        <w:rPr>
+          <w:rFonts w:ascii="Consolas" w:eastAsia="Times New Roman" w:hAnsi="Consolas" w:cs="Times New Roman"/>
+          <w:color w:val="A31515"/>
+          <w:kern w:val="0"/>
+          <w:sz w:val="21"/>
+          <w:szCs w:val="21"/>
+          <w:lang w:val="pl-PL"/>
+          <w14:ligatures w14:val="none"/>
+        </w:rPr>
+        <w:t xml:space="preserve">--- </w:t>
+      </w:r>
+    </w:p>
+    <w:p>
+      <w:pPr>
+        <w:shd w:val="clear" w:color="auto" w:fill="FFFFFF"/>
+        <w:spacing w:after="0" w:line="285" w:lineRule="atLeast"/>
+        <w:rPr>
+          <w:rFonts w:ascii="Consolas" w:eastAsia="Times New Roman" w:hAnsi="Consolas" w:cs="Times New Roman"/>
+          <w:color w:val="A31515"/>
+          <w:kern w:val="0"/>
+          <w:sz w:val="21"/>
+          <w:szCs w:val="21"/>
+          <w:lang w:val="pl-PL"/>
+          <w14:ligatures w14:val="none"/>
+        </w:rPr>
+      </w:pPr>
     </w:p>
     <w:p>
       <w:pPr>
@@ -263,6 +302,33 @@
           <w14:ligatures w14:val="none"/>
         </w:rPr>
       </w:pPr>
+      <w:r>
+        <w:rPr>
+          <w:rFonts w:ascii="Consolas" w:eastAsia="Times New Roman" w:hAnsi="Consolas" w:cs="Times New Roman"/>
+          <w:color w:val="A31515"/>
+          <w:kern w:val="0"/>
+          <w:sz w:val="21"/>
+          <w:szCs w:val="21"/>
+          <w:lang w:val="pl-PL"/>
+          <w14:ligatures w14:val="none"/>
+        </w:rPr>
+        <w:t xml:space="preserve">--- </w:t>
+      </w:r>
+    </w:p>
+    <w:p>
+      <w:pPr>
+        <w:shd w:val="clear" w:color="auto" w:fill="FFFFFF"/>
+        <w:spacing w:after="0" w:line="285" w:lineRule="atLeast"/>
+        <w:rPr>
+          <w:rFonts w:ascii="Consolas" w:eastAsia="Times New Roman" w:hAnsi="Consolas" w:cs="Times New Roman"/>
+          <w:color w:val="A31515"/>
+          <w:kern w:val="0"/>
+          <w:sz w:val="21"/>
+          <w:szCs w:val="21"/>
+          <w:lang w:val="pl-PL"/>
+          <w14:ligatures w14:val="none"/>
+        </w:rPr>
+      </w:pPr>
     </w:p>
     <w:p>
       <w:pPr>
@@ -411,6 +477,367 @@
           <w14:ligatures w14:val="none"/>
         </w:rPr>
       </w:pPr>
+      <w:r>
+        <w:rPr>
+          <w:rFonts w:ascii="Consolas" w:eastAsia="Times New Roman" w:hAnsi="Consolas" w:cs="Times New Roman"/>
+          <w:color w:val="A31515"/>
+          <w:kern w:val="0"/>
+          <w:sz w:val="21"/>
+          <w:szCs w:val="21"/>
+          <w:lang w:val="pl-PL"/>
+          <w14:ligatures w14:val="none"/>
+        </w:rPr>
+        <w:t xml:space="preserve">--- </w:t>
+      </w:r>
+    </w:p>
+    <w:p>
+      <w:pPr>
+        <w:shd w:val="clear" w:color="auto" w:fill="FFFFFF"/>
+        <w:spacing w:after="0" w:line="285" w:lineRule="atLeast"/>
+        <w:rPr>
+          <w:rFonts w:ascii="Consolas" w:eastAsia="Times New Roman" w:hAnsi="Consolas" w:cs="Times New Roman"/>
+          <w:color w:val="A31515"/>
+          <w:kern w:val="0"/>
+          <w:sz w:val="21"/>
+          <w:szCs w:val="21"/>
+          <w:lang w:val="pl-PL"/>
+          <w14:ligatures w14:val="none"/>
+        </w:rPr>
+      </w:pPr>
+    </w:p>
+    <w:p>
+      <w:pPr>
+        <w:shd w:val="clear" w:color="auto" w:fill="FFFFFF"/>
+        <w:spacing w:after="0" w:line="285" w:lineRule="atLeast"/>
+        <w:rPr>
+          <w:rFonts w:ascii="Consolas" w:eastAsia="Times New Roman" w:hAnsi="Consolas" w:cs="Times New Roman"/>
+          <w:color w:val="A31515"/>
+          <w:kern w:val="0"/>
+          <w:sz w:val="21"/>
+          <w:szCs w:val="21"/>
+          <w:lang w:val="pl-PL"/>
+          <w14:ligatures w14:val="none"/>
+        </w:rPr>
+      </w:pPr>
+      <w:r>
+        <w:rPr>
+          <w:rFonts w:ascii="Consolas" w:eastAsia="Times New Roman" w:hAnsi="Consolas" w:cs="Times New Roman"/>
+          <w:color w:val="A31515"/>
+          <w:kern w:val="0"/>
+          <w:sz w:val="21"/>
+          <w:szCs w:val="21"/>
+          <w:lang w:val="pl-PL"/>
+          <w14:ligatures w14:val="none"/>
+        </w:rPr>
+        <w:t>Minusy? D</w:t>
+      </w:r>
+      <w:r>
+        <w:rPr>
+          <w:rFonts w:ascii="Consolas" w:eastAsia="Times New Roman" w:hAnsi="Consolas" w:cs="Times New Roman"/>
+          <w:color w:val="A31515"/>
+          <w:kern w:val="0"/>
+          <w:sz w:val="21"/>
+          <w:szCs w:val="21"/>
+          <w:lang w:val="pl-PL"/>
+          <w14:ligatures w14:val="none"/>
+        </w:rPr>
+        <w:t>ość krótka nitka, która pomimo dość ciasnej konfiguracji jest jedynie na 26 sekund.</w:t>
+      </w:r>
+      <w:r>
+        <w:rPr>
+          <w:rFonts w:ascii="Consolas" w:eastAsia="Times New Roman" w:hAnsi="Consolas" w:cs="Times New Roman"/>
+          <w:color w:val="A31515"/>
+          <w:kern w:val="0"/>
+          <w:sz w:val="21"/>
+          <w:szCs w:val="21"/>
+          <w:lang w:val="pl-PL"/>
+          <w14:ligatures w14:val="none"/>
+        </w:rPr>
+        <w:t xml:space="preserve"> </w:t>
+      </w:r>
+      <w:r>
+        <w:rPr>
+          <w:rFonts w:ascii="Consolas" w:eastAsia="Times New Roman" w:hAnsi="Consolas" w:cs="Times New Roman"/>
+          <w:color w:val="A31515"/>
+          <w:kern w:val="0"/>
+          <w:sz w:val="21"/>
+          <w:szCs w:val="21"/>
+          <w:lang w:val="pl-PL"/>
+          <w14:ligatures w14:val="none"/>
+        </w:rPr>
+        <w:t>Wyobrażam sobie, że przy 8-10 wózkach (szczególnie z przypadkowymi osobami) frajda z jazdy może tam szy</w:t>
+      </w:r>
+      <w:r>
+        <w:rPr>
+          <w:rFonts w:ascii="Consolas" w:eastAsia="Times New Roman" w:hAnsi="Consolas" w:cs="Times New Roman"/>
+          <w:color w:val="A31515"/>
+          <w:kern w:val="0"/>
+          <w:sz w:val="21"/>
+          <w:szCs w:val="21"/>
+          <w:lang w:val="pl-PL"/>
+          <w14:ligatures w14:val="none"/>
+        </w:rPr>
+        <w:t>b</w:t>
+      </w:r>
+      <w:r>
+        <w:rPr>
+          <w:rFonts w:ascii="Consolas" w:eastAsia="Times New Roman" w:hAnsi="Consolas" w:cs="Times New Roman"/>
+          <w:color w:val="A31515"/>
+          <w:kern w:val="0"/>
+          <w:sz w:val="21"/>
+          <w:szCs w:val="21"/>
+          <w:lang w:val="pl-PL"/>
+          <w14:ligatures w14:val="none"/>
+        </w:rPr>
+        <w:t>ko zniknąć.</w:t>
+      </w:r>
+      <w:r>
+        <w:rPr>
+          <w:rFonts w:ascii="Consolas" w:eastAsia="Times New Roman" w:hAnsi="Consolas" w:cs="Times New Roman"/>
+          <w:color w:val="A31515"/>
+          <w:kern w:val="0"/>
+          <w:sz w:val="21"/>
+          <w:szCs w:val="21"/>
+          <w:lang w:val="pl-PL"/>
+          <w14:ligatures w14:val="none"/>
+        </w:rPr>
+        <w:t xml:space="preserve"> Ale i tak chcę tam wrócić!</w:t>
+      </w:r>
+    </w:p>
+    <w:p>
+      <w:pPr>
+        <w:shd w:val="clear" w:color="auto" w:fill="FFFFFF"/>
+        <w:spacing w:after="0" w:line="285" w:lineRule="atLeast"/>
+        <w:rPr>
+          <w:rFonts w:ascii="Consolas" w:eastAsia="Times New Roman" w:hAnsi="Consolas" w:cs="Times New Roman"/>
+          <w:color w:val="A31515"/>
+          <w:kern w:val="0"/>
+          <w:sz w:val="21"/>
+          <w:szCs w:val="21"/>
+          <w:lang w:val="pl-PL"/>
+          <w14:ligatures w14:val="none"/>
+        </w:rPr>
+      </w:pPr>
+      <w:r>
+        <w:rPr>
+          <w:rFonts w:ascii="Consolas" w:eastAsia="Times New Roman" w:hAnsi="Consolas" w:cs="Times New Roman"/>
+          <w:color w:val="A31515"/>
+          <w:kern w:val="0"/>
+          <w:sz w:val="21"/>
+          <w:szCs w:val="21"/>
+          <w:lang w:val="pl-PL"/>
+          <w14:ligatures w14:val="none"/>
+        </w:rPr>
+        <w:t xml:space="preserve">--- </w:t>
+      </w:r>
+    </w:p>
+    <w:p>
+      <w:pPr>
+        <w:shd w:val="clear" w:color="auto" w:fill="FFFFFF"/>
+        <w:spacing w:after="0" w:line="285" w:lineRule="atLeast"/>
+        <w:rPr>
+          <w:rFonts w:ascii="Consolas" w:eastAsia="Times New Roman" w:hAnsi="Consolas" w:cs="Times New Roman"/>
+          <w:color w:val="A31515"/>
+          <w:kern w:val="0"/>
+          <w:sz w:val="21"/>
+          <w:szCs w:val="21"/>
+          <w:lang w:val="pl-PL"/>
+          <w14:ligatures w14:val="none"/>
+        </w:rPr>
+      </w:pPr>
+    </w:p>
+    <w:p>
+      <w:pPr>
+        <w:shd w:val="clear" w:color="auto" w:fill="FFFFFF"/>
+        <w:spacing w:after="0" w:line="285" w:lineRule="atLeast"/>
+        <w:rPr>
+          <w:rFonts w:ascii="Consolas" w:eastAsia="Times New Roman" w:hAnsi="Consolas" w:cs="Times New Roman"/>
+          <w:color w:val="A31515"/>
+          <w:kern w:val="0"/>
+          <w:sz w:val="21"/>
+          <w:szCs w:val="21"/>
+          <w:lang w:val="pl-PL"/>
+          <w14:ligatures w14:val="none"/>
+        </w:rPr>
+      </w:pPr>
+      <w:r>
+        <w:rPr>
+          <w:rFonts w:ascii="Consolas" w:eastAsia="Times New Roman" w:hAnsi="Consolas" w:cs="Times New Roman"/>
+          <w:color w:val="A31515"/>
+          <w:kern w:val="0"/>
+          <w:sz w:val="21"/>
+          <w:szCs w:val="21"/>
+          <w:lang w:val="pl-PL"/>
+          <w14:ligatures w14:val="none"/>
+        </w:rPr>
+        <w:t>(UPDATE 25.12.2025)</w:t>
+      </w:r>
+    </w:p>
+    <w:p>
+      <w:pPr>
+        <w:shd w:val="clear" w:color="auto" w:fill="FFFFFF"/>
+        <w:spacing w:after="0" w:line="285" w:lineRule="atLeast"/>
+        <w:rPr>
+          <w:rFonts w:ascii="Consolas" w:eastAsia="Times New Roman" w:hAnsi="Consolas" w:cs="Times New Roman"/>
+          <w:color w:val="A31515"/>
+          <w:kern w:val="0"/>
+          <w:sz w:val="21"/>
+          <w:szCs w:val="21"/>
+          <w:lang w:val="pl-PL"/>
+          <w14:ligatures w14:val="none"/>
+        </w:rPr>
+      </w:pPr>
+    </w:p>
+    <w:p>
+      <w:pPr>
+        <w:shd w:val="clear" w:color="auto" w:fill="FFFFFF"/>
+        <w:spacing w:after="0" w:line="285" w:lineRule="atLeast"/>
+        <w:rPr>
+          <w:rFonts w:ascii="Consolas" w:eastAsia="Times New Roman" w:hAnsi="Consolas" w:cs="Times New Roman"/>
+          <w:color w:val="A31515"/>
+          <w:kern w:val="0"/>
+          <w:sz w:val="21"/>
+          <w:szCs w:val="21"/>
+          <w:lang w:val="pl-PL"/>
+          <w14:ligatures w14:val="none"/>
+        </w:rPr>
+      </w:pPr>
+      <w:r>
+        <w:rPr>
+          <w:rFonts w:ascii="Consolas" w:eastAsia="Times New Roman" w:hAnsi="Consolas" w:cs="Times New Roman"/>
+          <w:color w:val="A31515"/>
+          <w:kern w:val="0"/>
+          <w:sz w:val="21"/>
+          <w:szCs w:val="21"/>
+          <w:lang w:val="pl-PL"/>
+          <w14:ligatures w14:val="none"/>
+        </w:rPr>
+        <w:t xml:space="preserve">No i wróciłem – tak do samego Alicante, jak i na tor. Od razu pochwalę obsługę za możliwość skorzystania z kamery. Pozwolili mi przykleić mocowanie do ich kasku (uchwyt po prostu im zostawiłem). Fajnie było wrócić, bo jak piszę wyżej, wcześniej byłem w pustym, nowo-otwartym obiekcie. Teraz byłem w miejscu pełnym ludzi (jest tam też bilard, piłkarzyki etc.) po 3 latach, a więc już pojawiły się zniszczenia. </w:t>
+      </w:r>
+    </w:p>
+    <w:p>
+      <w:pPr>
+        <w:shd w:val="clear" w:color="auto" w:fill="FFFFFF"/>
+        <w:spacing w:after="0" w:line="285" w:lineRule="atLeast"/>
+        <w:rPr>
+          <w:rFonts w:ascii="Consolas" w:eastAsia="Times New Roman" w:hAnsi="Consolas" w:cs="Times New Roman"/>
+          <w:color w:val="A31515"/>
+          <w:kern w:val="0"/>
+          <w:sz w:val="21"/>
+          <w:szCs w:val="21"/>
+          <w:lang w:val="pl-PL"/>
+          <w14:ligatures w14:val="none"/>
+        </w:rPr>
+      </w:pPr>
+      <w:r>
+        <w:rPr>
+          <w:rFonts w:ascii="Consolas" w:eastAsia="Times New Roman" w:hAnsi="Consolas" w:cs="Times New Roman"/>
+          <w:color w:val="A31515"/>
+          <w:kern w:val="0"/>
+          <w:sz w:val="21"/>
+          <w:szCs w:val="21"/>
+          <w:lang w:val="pl-PL"/>
+          <w14:ligatures w14:val="none"/>
+        </w:rPr>
+        <w:t xml:space="preserve">--- </w:t>
+      </w:r>
+    </w:p>
+    <w:p>
+      <w:pPr>
+        <w:shd w:val="clear" w:color="auto" w:fill="FFFFFF"/>
+        <w:spacing w:after="0" w:line="285" w:lineRule="atLeast"/>
+        <w:rPr>
+          <w:rFonts w:ascii="Consolas" w:eastAsia="Times New Roman" w:hAnsi="Consolas" w:cs="Times New Roman"/>
+          <w:color w:val="A31515"/>
+          <w:kern w:val="0"/>
+          <w:sz w:val="21"/>
+          <w:szCs w:val="21"/>
+          <w:lang w:val="pl-PL"/>
+          <w14:ligatures w14:val="none"/>
+        </w:rPr>
+      </w:pPr>
+    </w:p>
+    <w:p>
+      <w:pPr>
+        <w:shd w:val="clear" w:color="auto" w:fill="FFFFFF"/>
+        <w:spacing w:after="0" w:line="285" w:lineRule="atLeast"/>
+        <w:rPr>
+          <w:rFonts w:ascii="Consolas" w:eastAsia="Times New Roman" w:hAnsi="Consolas" w:cs="Times New Roman"/>
+          <w:color w:val="A31515"/>
+          <w:kern w:val="0"/>
+          <w:sz w:val="21"/>
+          <w:szCs w:val="21"/>
+          <w:lang w:val="pl-PL"/>
+          <w14:ligatures w14:val="none"/>
+        </w:rPr>
+      </w:pPr>
+      <w:r>
+        <w:rPr>
+          <w:rFonts w:ascii="Consolas" w:eastAsia="Times New Roman" w:hAnsi="Consolas" w:cs="Times New Roman"/>
+          <w:color w:val="A31515"/>
+          <w:kern w:val="0"/>
+          <w:sz w:val="21"/>
+          <w:szCs w:val="21"/>
+          <w:lang w:val="pl-PL"/>
+          <w14:ligatures w14:val="none"/>
+        </w:rPr>
+        <w:t xml:space="preserve">Tłok nie przeszkadzał, wpuszczają na krótki tor (ma on w zasadzie 3 zakręty, przy czy pierwszy z mocnym hamowaniem z łuku jest fajnym miejscem treningowym) rozsądnie. Pierwszy zgrzyt pojawił się, gdy na pierwszą sesję wypuścili nas na ograniczonej mocy. Junior miał wykupione tylko 2 przejazdy, a ten pierwszy w zasadzie się przetoczyliśmy… Natomiast większy problem to wózki. Poprzednio je chwaliłem i trudno się dziwić, bo były nowiutkie. Teraz miały bardzo przykrą charakterystykę – traciły odczuwalnie moc po 4-5 kółkach! Obsługa powiedziała mi, </w:t>
+      </w:r>
+      <w:r>
+        <w:rPr>
+          <w:rFonts w:ascii="Consolas" w:eastAsia="Times New Roman" w:hAnsi="Consolas" w:cs="Times New Roman"/>
+          <w:color w:val="A31515"/>
+          <w:kern w:val="0"/>
+          <w:sz w:val="21"/>
+          <w:szCs w:val="21"/>
+          <w:lang w:val="pl-PL"/>
+          <w14:ligatures w14:val="none"/>
+        </w:rPr>
+        <w:lastRenderedPageBreak/>
+        <w:t xml:space="preserve">że to kwestia zużytych już baterii. Nigdy nie byłem fanem elektrycznych kartów, ale z czymś takim jeszcze się nie spotkałem. </w:t>
+      </w:r>
+    </w:p>
+    <w:p>
+      <w:pPr>
+        <w:shd w:val="clear" w:color="auto" w:fill="FFFFFF"/>
+        <w:spacing w:after="0" w:line="285" w:lineRule="atLeast"/>
+        <w:rPr>
+          <w:rFonts w:ascii="Consolas" w:eastAsia="Times New Roman" w:hAnsi="Consolas" w:cs="Times New Roman"/>
+          <w:color w:val="A31515"/>
+          <w:kern w:val="0"/>
+          <w:sz w:val="21"/>
+          <w:szCs w:val="21"/>
+          <w:lang w:val="pl-PL"/>
+          <w14:ligatures w14:val="none"/>
+        </w:rPr>
+      </w:pPr>
+      <w:r>
+        <w:rPr>
+          <w:rFonts w:ascii="Consolas" w:eastAsia="Times New Roman" w:hAnsi="Consolas" w:cs="Times New Roman"/>
+          <w:color w:val="A31515"/>
+          <w:kern w:val="0"/>
+          <w:sz w:val="21"/>
+          <w:szCs w:val="21"/>
+          <w:lang w:val="pl-PL"/>
+          <w14:ligatures w14:val="none"/>
+        </w:rPr>
+        <w:t xml:space="preserve">--- </w:t>
+      </w:r>
+    </w:p>
+    <w:p>
+      <w:pPr>
+        <w:shd w:val="clear" w:color="auto" w:fill="FFFFFF"/>
+        <w:spacing w:after="0" w:line="285" w:lineRule="atLeast"/>
+        <w:rPr>
+          <w:rFonts w:ascii="Consolas" w:eastAsia="Times New Roman" w:hAnsi="Consolas" w:cs="Times New Roman"/>
+          <w:color w:val="A31515"/>
+          <w:kern w:val="0"/>
+          <w:sz w:val="21"/>
+          <w:szCs w:val="21"/>
+          <w:lang w:val="pl-PL"/>
+          <w14:ligatures w14:val="none"/>
+        </w:rPr>
+      </w:pPr>
     </w:p>
     <w:p>
       <w:pPr>
@@ -436,79 +863,7 @@
           <w:lang w:val="pl-PL"/>
           <w14:ligatures w14:val="none"/>
         </w:rPr>
-        <w:t>Minusy? D</w:t>
-      </w:r>
-      <w:r>
-        <w:rPr>
-          <w:rFonts w:ascii="Consolas" w:eastAsia="Times New Roman" w:hAnsi="Consolas" w:cs="Times New Roman"/>
-          <w:color w:val="A31515"/>
-          <w:kern w:val="0"/>
-          <w:sz w:val="21"/>
-          <w:szCs w:val="21"/>
-          <w:lang w:val="pl-PL"/>
-          <w14:ligatures w14:val="none"/>
-        </w:rPr>
-        <w:t>ość krótka nitka, która pomimo dość ciasnej konfiguracji jest jedynie na 26 sekund.</w:t>
-      </w:r>
-      <w:r>
-        <w:rPr>
-          <w:rFonts w:ascii="Consolas" w:eastAsia="Times New Roman" w:hAnsi="Consolas" w:cs="Times New Roman"/>
-          <w:color w:val="A31515"/>
-          <w:kern w:val="0"/>
-          <w:sz w:val="21"/>
-          <w:szCs w:val="21"/>
-          <w:lang w:val="pl-PL"/>
-          <w14:ligatures w14:val="none"/>
-        </w:rPr>
-        <w:t xml:space="preserve"> </w:t>
-      </w:r>
-      <w:r>
-        <w:rPr>
-          <w:rFonts w:ascii="Consolas" w:eastAsia="Times New Roman" w:hAnsi="Consolas" w:cs="Times New Roman"/>
-          <w:color w:val="A31515"/>
-          <w:kern w:val="0"/>
-          <w:sz w:val="21"/>
-          <w:szCs w:val="21"/>
-          <w:lang w:val="pl-PL"/>
-          <w14:ligatures w14:val="none"/>
-        </w:rPr>
-        <w:t>Wyobrażam sobie, że przy 8-10 wózkach (szczególnie z przypadkowymi osobami) frajda z jazdy może tam szy</w:t>
-      </w:r>
-      <w:r>
-        <w:rPr>
-          <w:rFonts w:ascii="Consolas" w:eastAsia="Times New Roman" w:hAnsi="Consolas" w:cs="Times New Roman"/>
-          <w:color w:val="A31515"/>
-          <w:kern w:val="0"/>
-          <w:sz w:val="21"/>
-          <w:szCs w:val="21"/>
-          <w:lang w:val="pl-PL"/>
-          <w14:ligatures w14:val="none"/>
-        </w:rPr>
-        <w:t>b</w:t>
-      </w:r>
-      <w:r>
-        <w:rPr>
-          <w:rFonts w:ascii="Consolas" w:eastAsia="Times New Roman" w:hAnsi="Consolas" w:cs="Times New Roman"/>
-          <w:color w:val="A31515"/>
-          <w:kern w:val="0"/>
-          <w:sz w:val="21"/>
-          <w:szCs w:val="21"/>
-          <w:lang w:val="pl-PL"/>
-          <w14:ligatures w14:val="none"/>
-        </w:rPr>
-        <w:t>ko zniknąć.</w:t>
-      </w:r>
-      <w:r>
-        <w:rPr>
-          <w:rFonts w:ascii="Consolas" w:eastAsia="Times New Roman" w:hAnsi="Consolas" w:cs="Times New Roman"/>
-          <w:color w:val="A31515"/>
-          <w:kern w:val="0"/>
-          <w:sz w:val="21"/>
-          <w:szCs w:val="21"/>
-          <w:lang w:val="pl-PL"/>
-          <w14:ligatures w14:val="none"/>
-        </w:rPr>
-        <w:t xml:space="preserve"> Ale i tak chcę tam wrócić!</w:t>
+        <w:t xml:space="preserve">Jeszcze nigdy nie obniżyłem oceny po kolejnej wizycie, ale tu jest to niestety zasadne. Powiem Wam coś – kilka lat temu byłem zachwycony hiszpańskimi torami (być może dlatego, że zacząłem od rewelacyjnego toru w Madrycie), teraz doceniam to, że mają ich dużo, ale jakość zaczyna mocno odstawać od tego, co mamy w PL (choć paradoksalnie zazwyczaj też jest taniej).  </w:t>
       </w:r>
     </w:p>
     <w:p>
@@ -755,7 +1110,7 @@
           <w:szCs w:val="21"/>
           <w14:ligatures w14:val="none"/>
         </w:rPr>
-        <w:t>7.5</w:t>
+        <w:t>6.5</w:t>
       </w:r>
     </w:p>
     <w:p>
@@ -880,7 +1235,7 @@
 </file>
 
 <file path=word/styles.xml><?xml version="1.0" encoding="utf-8"?>
-<w:styles xmlns:mc="http://schemas.openxmlformats.org/markup-compatibility/2006" xmlns:r="http://schemas.openxmlformats.org/officeDocument/2006/relationships" xmlns:w="http://schemas.openxmlformats.org/wordprocessingml/2006/main" xmlns:w14="http://schemas.microsoft.com/office/word/2010/wordml" xmlns:w15="http://schemas.microsoft.com/office/word/2012/wordml" xmlns:w16cex="http://schemas.microsoft.com/office/word/2018/wordml/cex" xmlns:w16cid="http://schemas.microsoft.com/office/word/2016/wordml/cid" xmlns:w16="http://schemas.microsoft.com/office/word/2018/wordml" xmlns:w16sdtdh="http://schemas.microsoft.com/office/word/2020/wordml/sdtdatahash" xmlns:w16se="http://schemas.microsoft.com/office/word/2015/wordml/symex" mc:Ignorable="w14 w15 w16se w16cid w16 w16cex w16sdtdh">
+<w:styles xmlns:mc="http://schemas.openxmlformats.org/markup-compatibility/2006" xmlns:r="http://schemas.openxmlformats.org/officeDocument/2006/relationships" xmlns:w="http://schemas.openxmlformats.org/wordprocessingml/2006/main" xmlns:w14="http://schemas.microsoft.com/office/word/2010/wordml" xmlns:w15="http://schemas.microsoft.com/office/word/2012/wordml" xmlns:w16cex="http://schemas.microsoft.com/office/word/2018/wordml/cex" xmlns:w16cid="http://schemas.microsoft.com/office/word/2016/wordml/cid" xmlns:w16="http://schemas.microsoft.com/office/word/2018/wordml" xmlns:w16du="http://schemas.microsoft.com/office/word/2023/wordml/word16du" xmlns:w16sdtdh="http://schemas.microsoft.com/office/word/2020/wordml/sdtdatahash" xmlns:w16se="http://schemas.microsoft.com/office/word/2015/wordml/symex" mc:Ignorable="w14 w15 w16se w16cid w16 w16cex w16sdtdh w16du">
   <w:docDefaults>
     <w:rPrDefault>
       <w:rPr>
@@ -1279,6 +1634,7 @@
   <w:style w:type="paragraph" w:default="1" w:styleId="Normal">
     <w:name w:val="Normal"/>
     <w:qFormat/>
+    <w:rsid w:val="00367610"/>
   </w:style>
   <w:style w:type="character" w:default="1" w:styleId="DefaultParagraphFont">
     <w:name w:val="Default Paragraph Font"/>

</xml_diff>